<commit_message>
docs: agregar nota de seguridad Supabase en pendientes del resumen
- Sección "SEGURIDAD — CUANDO SUPEREMOS 200 MIEMBROS"
- Recordatorio de activar Leaked Password Protection (plan Pro Supabase)
  con contexto: por qué no es urgente ahora y cómo activarlo cuando aplique

Co-Authored-By: Claude Sonnet 4.6 <noreply@anthropic.com>
</commit_message>
<xml_diff>
--- a/DOCUMENTO RESUMEN ACTUALIZADO 20-05-2026.docx
+++ b/DOCUMENTO RESUMEN ACTUALIZADO 20-05-2026.docx
@@ -3833,6 +3833,41 @@
       </w:pPr>
       <w:r>
         <w:t>Testear flujo completo: registro -&gt; pago Wompi -&gt; activacion -&gt; picks -&gt; admin</w:t>
+      </w:r>
+    </w:p>
+    <w:p>
+      <w:pPr>
+        <w:spacing w:before="180" w:after="60"/>
+      </w:pPr>
+      <w:r>
+        <w:rPr>
+          <w:b/>
+          <w:bCs/>
+          <w:color w:val="1D4ED8"/>
+          <w:sz w:val="22"/>
+          <w:szCs w:val="22"/>
+        </w:rPr>
+        <w:t>SEGURIDAD — CUANDO SUPEREMOS 200 MIEMBROS</w:t>
+      </w:r>
+    </w:p>
+    <w:p>
+      <w:pPr>
+        <w:pStyle w:val="Prrafodelista"/>
+        <w:numPr>
+          <w:ilvl w:val="0"/>
+          <w:numId w:val="2"/>
+        </w:numPr>
+        <w:spacing w:before="40" w:after="40"/>
+      </w:pPr>
+      <w:r>
+        <w:rPr>
+          <w:b/>
+          <w:bCs/>
+        </w:rPr>
+        <w:t xml:space="preserve">Activar “Leaked password protection” en Supabase. </w:t>
+      </w:r>
+      <w:r>
+        <w:t>Supabase Authentication → Attack Protection → “Prevent use of leaked passwords”. Requiere plan Pro (~$25/mes). Verifica contraseñas contra HaveIBeenPwned.org al registro o cambio de contraseña. No es critico ahora (la rosca no maneja datos bancarios), pero recomendable al crecer. Actualmente DISABLED por ser plan Free.</w:t>
       </w:r>
     </w:p>
     <w:p>

</xml_diff>